<commit_message>
Fit TA guide time plans to 60-minute sections
Co-Authored-By: Claude Opus 5.5 <noreply@anthropic.com>
Claude-Session: https://claude.ai/code/session_01PCc5QsJWz1A92dEbnVgEDA
</commit_message>
<xml_diff>
--- a/دليل-المعيد-لشرح-السكاشن.docx
+++ b/دليل-المعيد-لشرح-السكاشن.docx
@@ -1038,7 +1038,7 @@
           <w:szCs w:val="24"/>
           <w:rtl/>
         </w:rPr>
-        <w:t xml:space="preserve"> تقسيم مقترح لـ 90 دقيقة، وعدّله حسب مدة السكشن عندك.</w:t>
+        <w:t xml:space="preserve"> تقسيم مقترح لسكشن مدته 60 دقيقة. إذا ضاق الوقت، حل مثالاً واحداً على السبورة واترك باقي التمارين واجباً منزلياً.</w:t>
       </w:r>
     </w:p>
     <w:p>
@@ -1507,7 +1507,7 @@
           <w:szCs w:val="32"/>
           <w:rtl/>
         </w:rPr>
-        <w:t xml:space="preserve">خطة الوقت (90 دقيقة)</w:t>
+        <w:t xml:space="preserve">خطة الوقت (60 دقيقة)</w:t>
       </w:r>
     </w:p>
     <w:tbl>
@@ -1638,7 +1638,7 @@
                 <w:szCs w:val="22"/>
                 <w:rtl/>
               </w:rPr>
-              <w:t xml:space="preserve">10 د</w:t>
+              <w:t xml:space="preserve">5 د</w:t>
             </w:r>
           </w:p>
         </w:tc>
@@ -1711,7 +1711,7 @@
                 <w:szCs w:val="22"/>
                 <w:rtl/>
               </w:rPr>
-              <w:t xml:space="preserve">20 د</w:t>
+              <w:t xml:space="preserve">15 د</w:t>
             </w:r>
           </w:p>
         </w:tc>
@@ -1745,7 +1745,7 @@
                 <w:szCs w:val="22"/>
                 <w:rtl/>
               </w:rPr>
-              <w:t xml:space="preserve">المقايضة: التعريف، النوعان، الصعوبات الأربع + قانون نسب المقايضة على السبورة.</w:t>
+              <w:t xml:space="preserve">المقايضة: التعريف، النوعان، الصعوبات الأربع + قانون نسب المقايضة.</w:t>
             </w:r>
           </w:p>
         </w:tc>
@@ -1784,7 +1784,7 @@
                 <w:szCs w:val="22"/>
                 <w:rtl/>
               </w:rPr>
-              <w:t xml:space="preserve">15 د</w:t>
+              <w:t xml:space="preserve">10 د</w:t>
             </w:r>
           </w:p>
         </w:tc>
@@ -1818,7 +1818,7 @@
                 <w:szCs w:val="22"/>
                 <w:rtl/>
               </w:rPr>
-              <w:t xml:space="preserve">تعريف النقود وما يتضمنه + الخصائص الثماني (جدول على السبورة).</w:t>
+              <w:t xml:space="preserve">تعريف النقود + الخصائص الثماني (جدول على السبورة).</w:t>
             </w:r>
           </w:p>
         </w:tc>
@@ -1857,7 +1857,7 @@
                 <w:szCs w:val="22"/>
                 <w:rtl/>
               </w:rPr>
-              <w:t xml:space="preserve">20 د</w:t>
+              <w:t xml:space="preserve">15 د</w:t>
             </w:r>
           </w:p>
         </w:tc>
@@ -1891,7 +1891,7 @@
                 <w:szCs w:val="22"/>
                 <w:rtl/>
               </w:rPr>
-              <w:t xml:space="preserve">الوظائف الأربع، وربط كل وظيفة بصعوبة من صعوبات المقايضة.</w:t>
+              <w:t xml:space="preserve">الوظائف الأربع وربط كل وظيفة بصعوبة من صعوبات المقايضة.</w:t>
             </w:r>
           </w:p>
         </w:tc>
@@ -1930,7 +1930,7 @@
                 <w:szCs w:val="22"/>
                 <w:rtl/>
               </w:rPr>
-              <w:t xml:space="preserve">10 د</w:t>
+              <w:t xml:space="preserve">5 د</w:t>
             </w:r>
           </w:p>
         </w:tc>
@@ -2003,7 +2003,7 @@
                 <w:szCs w:val="22"/>
                 <w:rtl/>
               </w:rPr>
-              <w:t xml:space="preserve">15 د</w:t>
+              <w:t xml:space="preserve">10 د</w:t>
             </w:r>
           </w:p>
         </w:tc>
@@ -2037,7 +2037,7 @@
                 <w:szCs w:val="22"/>
                 <w:rtl/>
               </w:rPr>
-              <w:t xml:space="preserve">تمارين وأسئلة سريعة.</w:t>
+              <w:t xml:space="preserve">المثال المحلول + الصح والخطأ.</w:t>
             </w:r>
           </w:p>
         </w:tc>
@@ -6608,7 +6608,7 @@
           <w:szCs w:val="32"/>
           <w:rtl/>
         </w:rPr>
-        <w:t xml:space="preserve">خطة الوقت (90 دقيقة)</w:t>
+        <w:t xml:space="preserve">خطة الوقت (60 دقيقة)</w:t>
       </w:r>
     </w:p>
     <w:tbl>
@@ -6739,7 +6739,7 @@
                 <w:szCs w:val="22"/>
                 <w:rtl/>
               </w:rPr>
-              <w:t xml:space="preserve">20 د</w:t>
+              <w:t xml:space="preserve">10 د</w:t>
             </w:r>
           </w:p>
         </w:tc>
@@ -6773,7 +6773,7 @@
                 <w:szCs w:val="22"/>
                 <w:rtl/>
               </w:rPr>
-              <w:t xml:space="preserve">أنواع النقود: خريطة ذهنية على السبورة (سلعية ← ائتمانية ← مصرفية ← إلكترونية).</w:t>
+              <w:t xml:space="preserve">أنواع النقود: خريطة على السبورة.</w:t>
             </w:r>
           </w:p>
         </w:tc>
@@ -6812,7 +6812,7 @@
                 <w:szCs w:val="22"/>
                 <w:rtl/>
               </w:rPr>
-              <w:t xml:space="preserve">10 د</w:t>
+              <w:t xml:space="preserve">5 د</w:t>
             </w:r>
           </w:p>
         </w:tc>
@@ -6846,7 +6846,7 @@
                 <w:szCs w:val="22"/>
                 <w:rtl/>
               </w:rPr>
-              <w:t xml:space="preserve">مفهوم النظام النقدي وعناصره الأربعة.</w:t>
+              <w:t xml:space="preserve">مفهوم النظام النقدي وعناصره.</w:t>
             </w:r>
           </w:p>
         </w:tc>
@@ -6885,7 +6885,7 @@
                 <w:szCs w:val="22"/>
                 <w:rtl/>
               </w:rPr>
-              <w:t xml:space="preserve">25 د</w:t>
+              <w:t xml:space="preserve">20 د</w:t>
             </w:r>
           </w:p>
         </w:tc>
@@ -6919,7 +6919,7 @@
                 <w:szCs w:val="22"/>
                 <w:rtl/>
               </w:rPr>
-              <w:t xml:space="preserve">قاعدة الذهب: المسكوكات ← السبائك ← الصرف بالذهب (جدول مقارنة) + أسباب الانهيار.</w:t>
+              <w:t xml:space="preserve">قاعدة الذهب: المراحل الثلاث (جدول مقارنة) + التوازن التلقائي + أسباب الانهيار.</w:t>
             </w:r>
           </w:p>
         </w:tc>
@@ -6958,7 +6958,7 @@
                 <w:szCs w:val="22"/>
                 <w:rtl/>
               </w:rPr>
-              <w:t xml:space="preserve">15 د</w:t>
+              <w:t xml:space="preserve">10 د</w:t>
             </w:r>
           </w:p>
         </w:tc>
@@ -6992,7 +6992,7 @@
                 <w:szCs w:val="22"/>
                 <w:rtl/>
               </w:rPr>
-              <w:t xml:space="preserve">نظام المعدنين وقانون جريشام بمثال رقمي.</w:t>
+              <w:t xml:space="preserve">نظام المعدنين وقانون جريشام بالمثال الرقمي.</w:t>
             </w:r>
           </w:p>
         </w:tc>
@@ -7031,7 +7031,7 @@
                 <w:szCs w:val="22"/>
                 <w:rtl/>
               </w:rPr>
-              <w:t xml:space="preserve">10 د</w:t>
+              <w:t xml:space="preserve">5 د</w:t>
             </w:r>
           </w:p>
         </w:tc>
@@ -7065,7 +7065,7 @@
                 <w:szCs w:val="22"/>
                 <w:rtl/>
               </w:rPr>
-              <w:t xml:space="preserve">النقد الورقي الإلزامي: خصائصه وتقييمه.</w:t>
+              <w:t xml:space="preserve">النقد الورقي الإلزامي وتقييمه.</w:t>
             </w:r>
           </w:p>
         </w:tc>
@@ -13393,7 +13393,7 @@
           <w:szCs w:val="32"/>
           <w:rtl/>
         </w:rPr>
-        <w:t xml:space="preserve">خطة الوقت (90 دقيقة)</w:t>
+        <w:t xml:space="preserve">خطة الوقت (60 دقيقة)</w:t>
       </w:r>
     </w:p>
     <w:tbl>
@@ -13524,7 +13524,7 @@
                 <w:szCs w:val="22"/>
                 <w:rtl/>
               </w:rPr>
-              <w:t xml:space="preserve">15 د</w:t>
+              <w:t xml:space="preserve">10 د</w:t>
             </w:r>
           </w:p>
         </w:tc>
@@ -13558,7 +13558,7 @@
                 <w:szCs w:val="22"/>
                 <w:rtl/>
               </w:rPr>
-              <w:t xml:space="preserve">مقاييس العرض النقدي: دوائر متداخلة M1 داخل M2 داخل M3.</w:t>
+              <w:t xml:space="preserve">مقاييس العرض النقدي M1 وM2 وM3 (دوائر متداخلة).</w:t>
             </w:r>
           </w:p>
         </w:tc>
@@ -13597,7 +13597,7 @@
                 <w:szCs w:val="22"/>
                 <w:rtl/>
               </w:rPr>
-              <w:t xml:space="preserve">25 د</w:t>
+              <w:t xml:space="preserve">15 د</w:t>
             </w:r>
           </w:p>
         </w:tc>
@@ -13631,7 +13631,7 @@
                 <w:szCs w:val="22"/>
                 <w:rtl/>
               </w:rPr>
-              <w:t xml:space="preserve">فيشر وكامبردج: المعادلات + مسألة محلولة + جدول الفروق.</w:t>
+              <w:t xml:space="preserve">فيشر وكامبردج + المثال المحلول 1.</w:t>
             </w:r>
           </w:p>
         </w:tc>
@@ -13670,7 +13670,7 @@
                 <w:szCs w:val="22"/>
                 <w:rtl/>
               </w:rPr>
-              <w:t xml:space="preserve">30 د</w:t>
+              <w:t xml:space="preserve">20 د</w:t>
             </w:r>
           </w:p>
         </w:tc>
@@ -13704,7 +13704,7 @@
                 <w:szCs w:val="22"/>
                 <w:rtl/>
               </w:rPr>
-              <w:t xml:space="preserve">كينز: الدوافع الثلاثة + مثال السند + رسم منحنى المضاربة ومصيدة السيولة.</w:t>
+              <w:t xml:space="preserve">كينز: الدوافع الثلاثة + مثال السند + منحنى المضاربة ومصيدة السيولة.</w:t>
             </w:r>
           </w:p>
         </w:tc>
@@ -13743,7 +13743,7 @@
                 <w:szCs w:val="22"/>
                 <w:rtl/>
               </w:rPr>
-              <w:t xml:space="preserve">20 د</w:t>
+              <w:t xml:space="preserve">15 د</w:t>
             </w:r>
           </w:p>
         </w:tc>
@@ -18302,7 +18302,7 @@
           <w:szCs w:val="32"/>
           <w:rtl/>
         </w:rPr>
-        <w:t xml:space="preserve">خطة الوقت (90 دقيقة)</w:t>
+        <w:t xml:space="preserve">خطة الوقت (60 دقيقة)</w:t>
       </w:r>
     </w:p>
     <w:tbl>
@@ -18433,7 +18433,7 @@
                 <w:szCs w:val="22"/>
                 <w:rtl/>
               </w:rPr>
-              <w:t xml:space="preserve">10 د</w:t>
+              <w:t xml:space="preserve">5 د</w:t>
             </w:r>
           </w:p>
         </w:tc>
@@ -18506,7 +18506,7 @@
                 <w:szCs w:val="22"/>
                 <w:rtl/>
               </w:rPr>
-              <w:t xml:space="preserve">15 د</w:t>
+              <w:t xml:space="preserve">10 د</w:t>
             </w:r>
           </w:p>
         </w:tc>
@@ -18579,7 +18579,7 @@
                 <w:szCs w:val="22"/>
                 <w:rtl/>
               </w:rPr>
-              <w:t xml:space="preserve">25 د</w:t>
+              <w:t xml:space="preserve">15 د</w:t>
             </w:r>
           </w:p>
         </w:tc>
@@ -18613,7 +18613,7 @@
                 <w:szCs w:val="22"/>
                 <w:rtl/>
               </w:rPr>
-              <w:t xml:space="preserve">جذب الطلب: شكل 4-1 (الحالات الثلاث) ثم 4-2 و4-3.</w:t>
+              <w:t xml:space="preserve">جذب الطلب: شكل 4-1 ثم 4-2 و4-3.</w:t>
             </w:r>
           </w:p>
         </w:tc>
@@ -18652,7 +18652,7 @@
                 <w:szCs w:val="22"/>
                 <w:rtl/>
               </w:rPr>
-              <w:t xml:space="preserve">25 د</w:t>
+              <w:t xml:space="preserve">15 د</w:t>
             </w:r>
           </w:p>
         </w:tc>
@@ -18725,7 +18725,7 @@
                 <w:szCs w:val="22"/>
                 <w:rtl/>
               </w:rPr>
-              <w:t xml:space="preserve">15 د</w:t>
+              <w:t xml:space="preserve">5 د</w:t>
             </w:r>
           </w:p>
         </w:tc>
@@ -18759,7 +18759,80 @@
                 <w:szCs w:val="22"/>
                 <w:rtl/>
               </w:rPr>
-              <w:t xml:space="preserve">النظرية الهيكلية + تمارين.</w:t>
+              <w:t xml:space="preserve">النظرية الهيكلية (عرض سريع).</w:t>
+            </w:r>
+          </w:p>
+        </w:tc>
+      </w:tr>
+      <w:tr>
+        <w:trPr>
+          <w:tblHeader w:val="false"/>
+        </w:trPr>
+        <w:tc>
+          <w:tcPr>
+            <w:tcW w:type="dxa" w:w="1800"/>
+            <w:tcBorders>
+              <w:top w:val="single" w:color="BFBFBF" w:sz="4"/>
+              <w:left w:val="single" w:color="BFBFBF" w:sz="4"/>
+              <w:bottom w:val="single" w:color="BFBFBF" w:sz="4"/>
+              <w:right w:val="single" w:color="BFBFBF" w:sz="4"/>
+            </w:tcBorders>
+            <w:shd w:fill="F2F7FC" w:color="auto" w:val="clear"/>
+            <w:tcMar>
+              <w:top w:type="dxa" w:w="80"/>
+              <w:left w:type="dxa" w:w="120"/>
+              <w:bottom w:type="dxa" w:w="80"/>
+              <w:right w:type="dxa" w:w="120"/>
+            </w:tcMar>
+          </w:tcPr>
+          <w:p>
+            <w:pPr>
+              <w:bidi/>
+              <w:jc w:val="right"/>
+            </w:pPr>
+            <w:r>
+              <w:rPr>
+                <w:rFonts w:ascii="Arial" w:cs="Arial" w:eastAsia="Arial" w:hAnsi="Arial"/>
+                <w:b w:val="false"/>
+                <w:sz w:val="22"/>
+                <w:szCs w:val="22"/>
+                <w:rtl/>
+              </w:rPr>
+              <w:t xml:space="preserve">10 د</w:t>
+            </w:r>
+          </w:p>
+        </w:tc>
+        <w:tc>
+          <w:tcPr>
+            <w:tcW w:type="dxa" w:w="7226"/>
+            <w:tcBorders>
+              <w:top w:val="single" w:color="BFBFBF" w:sz="4"/>
+              <w:left w:val="single" w:color="BFBFBF" w:sz="4"/>
+              <w:bottom w:val="single" w:color="BFBFBF" w:sz="4"/>
+              <w:right w:val="single" w:color="BFBFBF" w:sz="4"/>
+            </w:tcBorders>
+            <w:shd w:fill="F2F7FC" w:color="auto" w:val="clear"/>
+            <w:tcMar>
+              <w:top w:type="dxa" w:w="80"/>
+              <w:left w:type="dxa" w:w="120"/>
+              <w:bottom w:type="dxa" w:w="80"/>
+              <w:right w:type="dxa" w:w="120"/>
+            </w:tcMar>
+          </w:tcPr>
+          <w:p>
+            <w:pPr>
+              <w:bidi/>
+              <w:jc w:val="right"/>
+            </w:pPr>
+            <w:r>
+              <w:rPr>
+                <w:rFonts w:ascii="Arial" w:cs="Arial" w:eastAsia="Arial" w:hAnsi="Arial"/>
+                <w:b w:val="false"/>
+                <w:sz w:val="22"/>
+                <w:szCs w:val="22"/>
+                <w:rtl/>
+              </w:rPr>
+              <w:t xml:space="preserve">تمارين.</w:t>
             </w:r>
           </w:p>
         </w:tc>
@@ -23194,7 +23267,7 @@
           <w:szCs w:val="32"/>
           <w:rtl/>
         </w:rPr>
-        <w:t xml:space="preserve">خطة الوقت (90 دقيقة)</w:t>
+        <w:t xml:space="preserve">خطة الوقت (60 دقيقة)</w:t>
       </w:r>
     </w:p>
     <w:tbl>
@@ -23325,7 +23398,7 @@
                 <w:szCs w:val="22"/>
                 <w:rtl/>
               </w:rPr>
-              <w:t xml:space="preserve">15 د</w:t>
+              <w:t xml:space="preserve">10 د</w:t>
             </w:r>
           </w:p>
         </w:tc>
@@ -23359,7 +23432,7 @@
                 <w:szCs w:val="22"/>
                 <w:rtl/>
               </w:rPr>
-              <w:t xml:space="preserve">الدخل الحقيقي + الفئات الأربع (مسألة سريعة).</w:t>
+              <w:t xml:space="preserve">الدخل الحقيقي + الفئات الأربع.</w:t>
             </w:r>
           </w:p>
         </w:tc>
@@ -23398,7 +23471,7 @@
                 <w:szCs w:val="22"/>
                 <w:rtl/>
               </w:rPr>
-              <w:t xml:space="preserve">15 د</w:t>
+              <w:t xml:space="preserve">10 د</w:t>
             </w:r>
           </w:p>
         </w:tc>
@@ -23471,7 +23544,7 @@
                 <w:szCs w:val="22"/>
                 <w:rtl/>
               </w:rPr>
-              <w:t xml:space="preserve">45 د</w:t>
+              <w:t xml:space="preserve">30 د</w:t>
             </w:r>
           </w:p>
         </w:tc>
@@ -23544,7 +23617,7 @@
                 <w:szCs w:val="22"/>
                 <w:rtl/>
               </w:rPr>
-              <w:t xml:space="preserve">15 د</w:t>
+              <w:t xml:space="preserve">10 د</w:t>
             </w:r>
           </w:p>
         </w:tc>
@@ -23578,7 +23651,7 @@
                 <w:szCs w:val="22"/>
                 <w:rtl/>
               </w:rPr>
-              <w:t xml:space="preserve">يحل الطلاب مسألة مشابهة في مجموعات.</w:t>
+              <w:t xml:space="preserve">مسائل التمارين.</w:t>
             </w:r>
           </w:p>
         </w:tc>
@@ -31415,7 +31488,7 @@
           <w:szCs w:val="32"/>
           <w:rtl/>
         </w:rPr>
-        <w:t xml:space="preserve">خطة الوقت (90 دقيقة)</w:t>
+        <w:t xml:space="preserve">خطة الوقت (60 دقيقة)</w:t>
       </w:r>
     </w:p>
     <w:tbl>
@@ -31546,7 +31619,7 @@
                 <w:szCs w:val="22"/>
                 <w:rtl/>
               </w:rPr>
-              <w:t xml:space="preserve">15 د</w:t>
+              <w:t xml:space="preserve">10 د</w:t>
             </w:r>
           </w:p>
         </w:tc>
@@ -31619,7 +31692,7 @@
                 <w:szCs w:val="22"/>
                 <w:rtl/>
               </w:rPr>
-              <w:t xml:space="preserve">20 د</w:t>
+              <w:t xml:space="preserve">15 د</w:t>
             </w:r>
           </w:p>
         </w:tc>
@@ -31653,7 +31726,7 @@
                 <w:szCs w:val="22"/>
                 <w:rtl/>
               </w:rPr>
-              <w:t xml:space="preserve">خريطة أنواع الأسواق على السبورة (شجرة).</w:t>
+              <w:t xml:space="preserve">شجرة أنواع الأسواق على السبورة.</w:t>
             </w:r>
           </w:p>
         </w:tc>
@@ -31692,7 +31765,7 @@
                 <w:szCs w:val="22"/>
                 <w:rtl/>
               </w:rPr>
-              <w:t xml:space="preserve">10 د</w:t>
+              <w:t xml:space="preserve">5 د</w:t>
             </w:r>
           </w:p>
         </w:tc>
@@ -31765,7 +31838,7 @@
                 <w:szCs w:val="22"/>
                 <w:rtl/>
               </w:rPr>
-              <w:t xml:space="preserve">30 د</w:t>
+              <w:t xml:space="preserve">20 د</w:t>
             </w:r>
           </w:p>
         </w:tc>
@@ -31799,7 +31872,7 @@
                 <w:szCs w:val="22"/>
                 <w:rtl/>
               </w:rPr>
-              <w:t xml:space="preserve">الأسهم (القيم والأنواع) والسندات (المعايير الخمسة) والمشتقات.</w:t>
+              <w:t xml:space="preserve">الأسهم (القيم والأنواع + مثال القيمة الدفترية) والسندات والمشتقات.</w:t>
             </w:r>
           </w:p>
         </w:tc>
@@ -31838,7 +31911,7 @@
                 <w:szCs w:val="22"/>
                 <w:rtl/>
               </w:rPr>
-              <w:t xml:space="preserve">15 د</w:t>
+              <w:t xml:space="preserve">10 د</w:t>
             </w:r>
           </w:p>
         </w:tc>
@@ -38820,7 +38893,7 @@
           <w:szCs w:val="32"/>
           <w:rtl/>
         </w:rPr>
-        <w:t xml:space="preserve">خطة الوقت (90 دقيقة)</w:t>
+        <w:t xml:space="preserve">خطة الوقت (60 دقيقة)</w:t>
       </w:r>
     </w:p>
     <w:tbl>
@@ -38951,7 +39024,7 @@
                 <w:szCs w:val="22"/>
                 <w:rtl/>
               </w:rPr>
-              <w:t xml:space="preserve">15 د</w:t>
+              <w:t xml:space="preserve">10 د</w:t>
             </w:r>
           </w:p>
         </w:tc>
@@ -38985,7 +39058,7 @@
                 <w:szCs w:val="22"/>
                 <w:rtl/>
               </w:rPr>
-              <w:t xml:space="preserve">السند المخصوم والعلاقة العكسية (مسألة).</w:t>
+              <w:t xml:space="preserve">السند المخصوم والعلاقة العكسية (المثال 1).</w:t>
             </w:r>
           </w:p>
         </w:tc>
@@ -39024,7 +39097,7 @@
                 <w:szCs w:val="22"/>
                 <w:rtl/>
               </w:rPr>
-              <w:t xml:space="preserve">20 د</w:t>
+              <w:t xml:space="preserve">15 د</w:t>
             </w:r>
           </w:p>
         </w:tc>
@@ -39058,7 +39131,7 @@
                 <w:szCs w:val="22"/>
                 <w:rtl/>
               </w:rPr>
-              <w:t xml:space="preserve">رسم الطلب والعرض والتوازن (شكل 6-3) وفائض الطلب والعرض.</w:t>
+              <w:t xml:space="preserve">رسم الطلب والعرض والتوازن وفائض الطلب والعرض.</w:t>
             </w:r>
           </w:p>
         </w:tc>
@@ -39097,7 +39170,7 @@
                 <w:szCs w:val="22"/>
                 <w:rtl/>
               </w:rPr>
-              <w:t xml:space="preserve">25 د</w:t>
+              <w:t xml:space="preserve">15 د</w:t>
             </w:r>
           </w:p>
         </w:tc>
@@ -39170,7 +39243,7 @@
                 <w:szCs w:val="22"/>
                 <w:rtl/>
               </w:rPr>
-              <w:t xml:space="preserve">15 د</w:t>
+              <w:t xml:space="preserve">10 د</w:t>
             </w:r>
           </w:p>
         </w:tc>
@@ -39204,7 +39277,7 @@
                 <w:szCs w:val="22"/>
                 <w:rtl/>
               </w:rPr>
-              <w:t xml:space="preserve">تحليل الحالات المركبة (التضخم المتوقع، الرواج).</w:t>
+              <w:t xml:space="preserve">الحالات المركبة: التضخم المتوقع والرواج.</w:t>
             </w:r>
           </w:p>
         </w:tc>
@@ -39243,7 +39316,7 @@
                 <w:szCs w:val="22"/>
                 <w:rtl/>
               </w:rPr>
-              <w:t xml:space="preserve">15 د</w:t>
+              <w:t xml:space="preserve">10 د</w:t>
             </w:r>
           </w:p>
         </w:tc>

</xml_diff>